<commit_message>
Update PROJECT_REPORT.docx with embedded benchmark graphs and thread scaling analysis
</commit_message>
<xml_diff>
--- a/PROJECT_REPORT.docx
+++ b/PROJECT_REPORT.docx
@@ -20,14 +20,14 @@
     </w:p>
     <w:p>
       <w:pPr>
-        <w:spacing w:after="360"/>
+        <w:spacing w:after="320"/>
         <w:jc w:val="center"/>
       </w:pPr>
       <w:r>
         <w:rPr>
           <w:i/>
           <w:color w:val="2B6CB0"/>
-          <w:sz w:val="26"/>
+          <w:sz w:val="25"/>
         </w:rPr>
         <w:t>Algorithmic Implementation, Complexity Modeling, and Empirical Scalability Analysis for Multi-Megapixel Images and Increasing Dataset Sizes</w:t>
       </w:r>
@@ -144,7 +144,37 @@
                 <w:b/>
                 <w:sz w:val="19"/>
               </w:rPr>
-              <w:t>Experimental Hardware</w:t>
+              <w:t>Concurrency Setup</w:t>
+            </w:r>
+          </w:p>
+        </w:tc>
+        <w:tc>
+          <w:tcPr>
+            <w:tcW w:type="dxa" w:w="6192"/>
+          </w:tcPr>
+          <w:p>
+            <w:r>
+              <w:rPr>
+                <w:sz w:val="19"/>
+              </w:rPr>
+              <w:t>12 Logical CPU Cores, Work-Stealing ForkJoinPool, Parallel Stream Batching</w:t>
+            </w:r>
+          </w:p>
+        </w:tc>
+      </w:tr>
+      <w:tr>
+        <w:tc>
+          <w:tcPr>
+            <w:tcW w:type="dxa" w:w="3168"/>
+            <w:shd w:fill="EDF2F7"/>
+          </w:tcPr>
+          <w:p>
+            <w:r>
+              <w:rPr>
+                <w:b/>
+                <w:sz w:val="19"/>
+              </w:rPr>
+              <w:t>Hardware Specs</w:t>
             </w:r>
           </w:p>
         </w:tc>
@@ -207,7 +237,7 @@
         <w:rPr>
           <w:b/>
           <w:color w:val="1A365D"/>
-          <w:sz w:val="36"/>
+          <w:sz w:val="34"/>
         </w:rPr>
         <w:t>1. Abstract</w:t>
       </w:r>
@@ -224,7 +254,7 @@
         <w:br/>
         <w:t>1. Large Image Scaling: Evaluated across progressive resolutions from 256x256 (0.07 MP) up to 3072x3072 (~9.44 MP). SLIC Superpixel segmentation maintained strictly linear O(N) scaling with steady throughput (~2.2 MP/s), whereas Felzenszwalb incurred an O(E log E) edge-sorting bottleneck on 37.7 million edges at 9.44 MP.</w:t>
         <w:br/>
-        <w:t>2. Dataset Size Scaling: Evaluated on batches from 5 to 50 images. By exploiting Java's ForkJoinPool parallel streams, we achieved a 6.8x multi-threaded speedup on a 12-core CPU, reducing per-image latency to 17.3 ms (~58 images/second).</w:t>
+        <w:t>2. Dataset Size Scaling &amp; Multithreading: Evaluated on batches from 5 to 50 images. By exploiting Java's ForkJoinPool parallel worker threads across 12 CPU cores, we achieved a 6.8x speedup, reducing per-image latency to 17.3 ms (~58 images/second).</w:t>
         <w:br/>
         <w:br/>
         <w:t>Quantitative evaluation against synthetic ground-truth masks confirmed that Felzenszwalb achieved the highest region delineation (0.9171 mIoU, 0.9383 Boundary F1), while SLIC provided optimal geometric compactness.</w:t>
@@ -239,7 +269,7 @@
         <w:rPr>
           <w:b/>
           <w:color w:val="1A365D"/>
-          <w:sz w:val="36"/>
+          <w:sz w:val="34"/>
         </w:rPr>
         <w:t>2. Problem Formulation &amp; Mathematical Model</w:t>
       </w:r>
@@ -266,7 +296,7 @@
         <w:rPr>
           <w:b/>
           <w:color w:val="1A365D"/>
-          <w:sz w:val="36"/>
+          <w:sz w:val="34"/>
         </w:rPr>
         <w:t>3. Algorithmic Solutions Developed in Java</w:t>
       </w:r>
@@ -280,7 +310,7 @@
         <w:rPr>
           <w:b/>
           <w:color w:val="2B6CB0"/>
-          <w:sz w:val="28"/>
+          <w:sz w:val="27"/>
         </w:rPr>
         <w:t>3.1 SLIC Superpixel Segmentation (Achanta et al., TPAMI 2012)</w:t>
       </w:r>
@@ -303,7 +333,7 @@
         <w:rPr>
           <w:b/>
           <w:color w:val="2B6CB0"/>
-          <w:sz w:val="28"/>
+          <w:sz w:val="27"/>
         </w:rPr>
         <w:t>3.2 K-Means Clustering with K-Means++ in CIELAB</w:t>
       </w:r>
@@ -322,7 +352,7 @@
         <w:rPr>
           <w:b/>
           <w:color w:val="2B6CB0"/>
-          <w:sz w:val="28"/>
+          <w:sz w:val="27"/>
         </w:rPr>
         <w:t>3.3 Felzenszwalb-Huttenlocher Graph-Based Segmentation (IJCV 2004)</w:t>
       </w:r>
@@ -341,7 +371,7 @@
         <w:rPr>
           <w:b/>
           <w:color w:val="2B6CB0"/>
-          <w:sz w:val="28"/>
+          <w:sz w:val="27"/>
         </w:rPr>
         <w:t>3.4 Multi-Level Otsu Thresholding</w:t>
       </w:r>
@@ -360,7 +390,7 @@
         <w:rPr>
           <w:b/>
           <w:color w:val="1A365D"/>
-          <w:sz w:val="36"/>
+          <w:sz w:val="34"/>
         </w:rPr>
         <w:t>4. Dataset Methodology &amp; Benchmarks Cited</w:t>
       </w:r>
@@ -386,7 +416,7 @@
         <w:br/>
         <w:t>3. Procedural Synthetic Ground-Truth Generator (Built-in Java Utility):</w:t>
         <w:br/>
-        <w:t xml:space="preserve">   Renders multi-object geometric scenes with additive Gaussian sensor noise (σ = 6.0) and generates exact pixel-level ground-truth masks for quantitative mIoU, Dice, and Boundary F1 calculation.</w:t>
+        <w:t xml:space="preserve">   Renders multi-region geometric scenes with additive Gaussian sensor noise (σ = 6.0) and generates exact pixel-level ground-truth masks for quantitative mIoU, Dice, and Boundary F1 calculation.</w:t>
       </w:r>
     </w:p>
     <w:p>
@@ -398,7 +428,7 @@
         <w:rPr>
           <w:b/>
           <w:color w:val="1A365D"/>
-          <w:sz w:val="36"/>
+          <w:sz w:val="34"/>
         </w:rPr>
         <w:t>5. Investigation 1: Scalability on Large Multi-Megapixel Images</w:t>
       </w:r>
@@ -2268,14 +2298,105 @@
     </w:p>
     <w:p>
       <w:r>
-        <w:t>Key Takeaways on Large Images:</w:t>
-        <w:br/>
-        <w:t>• SLIC Superpixel segmentation scales in strictly linear O(N) time, sustaining steady throughput of ~2.2 MP/s regardless of resolution.</w:t>
-        <w:br/>
-        <w:t>• Felzenszwalb Graph-Based segmentation exhibits superlinear O(E log E) scaling. At 9.44 MP, allocating and sorting 37.7 million graph edges increases runtime to 66.8 seconds.</w:t>
-        <w:br/>
-        <w:t>• K-Means leverages multi-threaded pixel assignment, processing 9.44 MP in under 4.5 seconds.</w:t>
+        <w:rPr>
+          <w:b/>
+          <w:color w:val="1A365D"/>
+          <w:sz w:val="21"/>
+        </w:rPr>
+        <w:t>Figure 1: Large Image Scaling (Execution Time vs. Megapixels)</w:t>
       </w:r>
+    </w:p>
+    <w:p>
+      <w:r>
+        <w:drawing>
+          <wp:inline xmlns:a="http://schemas.openxmlformats.org/drawingml/2006/main" xmlns:pic="http://schemas.openxmlformats.org/drawingml/2006/picture">
+            <wp:extent cx="5486400" cy="3352800"/>
+            <wp:docPr id="1" name="Picture 1"/>
+            <wp:cNvGraphicFramePr>
+              <a:graphicFrameLocks noChangeAspect="1"/>
+            </wp:cNvGraphicFramePr>
+            <a:graphic>
+              <a:graphicData uri="http://schemas.openxmlformats.org/drawingml/2006/picture">
+                <pic:pic>
+                  <pic:nvPicPr>
+                    <pic:cNvPr id="0" name="graph_resolution_scaling.png"/>
+                    <pic:cNvPicPr/>
+                  </pic:nvPicPr>
+                  <pic:blipFill>
+                    <a:blip r:embed="rId9"/>
+                    <a:stretch>
+                      <a:fillRect/>
+                    </a:stretch>
+                  </pic:blipFill>
+                  <pic:spPr>
+                    <a:xfrm>
+                      <a:off x="0" y="0"/>
+                      <a:ext cx="5486400" cy="3352800"/>
+                    </a:xfrm>
+                    <a:prstGeom prst="rect"/>
+                  </pic:spPr>
+                </pic:pic>
+              </a:graphicData>
+            </a:graphic>
+          </wp:inline>
+        </w:drawing>
+      </w:r>
+    </w:p>
+    <w:p>
+      <w:pPr>
+        <w:spacing w:after="120"/>
+      </w:pPr>
+    </w:p>
+    <w:p>
+      <w:r>
+        <w:rPr>
+          <w:b/>
+          <w:color w:val="1A365D"/>
+          <w:sz w:val="21"/>
+        </w:rPr>
+        <w:t>Figure 2: Processing Throughput (Megapixels/sec) across Resolutions</w:t>
+      </w:r>
+    </w:p>
+    <w:p>
+      <w:r>
+        <w:drawing>
+          <wp:inline xmlns:a="http://schemas.openxmlformats.org/drawingml/2006/main" xmlns:pic="http://schemas.openxmlformats.org/drawingml/2006/picture">
+            <wp:extent cx="5486400" cy="3169920"/>
+            <wp:docPr id="2" name="Picture 2"/>
+            <wp:cNvGraphicFramePr>
+              <a:graphicFrameLocks noChangeAspect="1"/>
+            </wp:cNvGraphicFramePr>
+            <a:graphic>
+              <a:graphicData uri="http://schemas.openxmlformats.org/drawingml/2006/picture">
+                <pic:pic>
+                  <pic:nvPicPr>
+                    <pic:cNvPr id="0" name="graph_throughput_comparison.png"/>
+                    <pic:cNvPicPr/>
+                  </pic:nvPicPr>
+                  <pic:blipFill>
+                    <a:blip r:embed="rId10"/>
+                    <a:stretch>
+                      <a:fillRect/>
+                    </a:stretch>
+                  </pic:blipFill>
+                  <pic:spPr>
+                    <a:xfrm>
+                      <a:off x="0" y="0"/>
+                      <a:ext cx="5486400" cy="3169920"/>
+                    </a:xfrm>
+                    <a:prstGeom prst="rect"/>
+                  </pic:spPr>
+                </pic:pic>
+              </a:graphicData>
+            </a:graphic>
+          </wp:inline>
+        </w:drawing>
+      </w:r>
+    </w:p>
+    <w:p>
+      <w:pPr>
+        <w:spacing w:after="160"/>
+      </w:pPr>
     </w:p>
     <w:p>
       <w:pPr>
@@ -2286,14 +2407,30 @@
         <w:rPr>
           <w:b/>
           <w:color w:val="1A365D"/>
-          <w:sz w:val="36"/>
+          <w:sz w:val="34"/>
         </w:rPr>
-        <w:t>6. Investigation 2: Scalability on Increasing Dataset Sizes</w:t>
+        <w:t>6. Investigation 2: Concurrency, Number of Threads &amp; Dataset Batch Scaling</w:t>
       </w:r>
     </w:p>
     <w:p>
       <w:r>
-        <w:t>Batch segmentation throughput was tested using SLIC Superpixels (k=120) across batches of 512x512 images, comparing single-threaded sequential execution against 12-core multi-threaded parallel execution:</w:t>
+        <w:t>To investigate performance across increasing dataset sizes, we evaluated the framework under multi-threaded parallel execution against a single-threaded baseline. The host hardware provided 12 logical CPU cores.</w:t>
+        <w:br/>
+        <w:br/>
+        <w:t>Concurrency Architecture:</w:t>
+        <w:br/>
+        <w:t>1. Intra-Image Parallelism: In K-Means, pixel-to-centroid distance calculations are split into parallel chunks across all 12 cores using Java's IntStream.range(0, numPixels).parallel().</w:t>
+        <w:br/>
+        <w:t>2. Inter-Image Batch Parallelism: When processing a dataset of N images, each image is an independent task (embarrassingly parallel). Java's ForkJoinPool work-stealing scheduler allocates worker threads matching available CPU cores (12 threads).</w:t>
+        <w:br/>
+        <w:br/>
+        <w:t>Amdahl's Law Modeling:</w:t>
+        <w:br/>
+        <w:t>Speedup S(P) for P processor threads is bounded by the non-parallelizable sequential fraction s:</w:t>
+        <w:br/>
+        <w:t xml:space="preserve">   S(P) = 1 / ( s + (1 - s) / P )</w:t>
+        <w:br/>
+        <w:t>Parallel Efficiency is calculated as: E = (S / P) * 100%.</w:t>
       </w:r>
     </w:p>
     <w:tbl>
@@ -2339,7 +2476,7 @@
                 <w:color w:val="FFFFFF"/>
                 <w:sz w:val="19"/>
               </w:rPr>
-              <w:t>Mode</w:t>
+              <w:t>Execution Mode</w:t>
             </w:r>
           </w:p>
         </w:tc>
@@ -2434,7 +2571,7 @@
               <w:rPr>
                 <w:sz w:val="18"/>
               </w:rPr>
-              <w:t>Sequential (1T)</w:t>
+              <w:t>Sequential (1 Thread)</w:t>
             </w:r>
           </w:p>
         </w:tc>
@@ -2522,7 +2659,7 @@
               <w:rPr>
                 <w:sz w:val="18"/>
               </w:rPr>
-              <w:t>Parallel (12T)</w:t>
+              <w:t>Parallel (12 Threads)</w:t>
             </w:r>
           </w:p>
         </w:tc>
@@ -2610,7 +2747,7 @@
               <w:rPr>
                 <w:sz w:val="18"/>
               </w:rPr>
-              <w:t>Sequential (1T)</w:t>
+              <w:t>Sequential (1 Thread)</w:t>
             </w:r>
           </w:p>
         </w:tc>
@@ -2698,7 +2835,7 @@
               <w:rPr>
                 <w:sz w:val="18"/>
               </w:rPr>
-              <w:t>Parallel (12T)</w:t>
+              <w:t>Parallel (12 Threads)</w:t>
             </w:r>
           </w:p>
         </w:tc>
@@ -2786,7 +2923,7 @@
               <w:rPr>
                 <w:sz w:val="18"/>
               </w:rPr>
-              <w:t>Sequential (1T)</w:t>
+              <w:t>Sequential (1 Thread)</w:t>
             </w:r>
           </w:p>
         </w:tc>
@@ -2874,7 +3011,7 @@
               <w:rPr>
                 <w:sz w:val="18"/>
               </w:rPr>
-              <w:t>Parallel (12T)</w:t>
+              <w:t>Parallel (12 Threads)</w:t>
             </w:r>
           </w:p>
         </w:tc>
@@ -2962,7 +3099,7 @@
               <w:rPr>
                 <w:sz w:val="18"/>
               </w:rPr>
-              <w:t>Sequential (1T)</w:t>
+              <w:t>Sequential (1 Thread)</w:t>
             </w:r>
           </w:p>
         </w:tc>
@@ -3050,7 +3187,7 @@
               <w:rPr>
                 <w:sz w:val="18"/>
               </w:rPr>
-              <w:t>Parallel (12T)</w:t>
+              <w:t>Parallel (12 Threads)</w:t>
             </w:r>
           </w:p>
         </w:tc>
@@ -3120,10 +3257,105 @@
     </w:p>
     <w:p>
       <w:r>
-        <w:t>Concurrency Takeaway:</w:t>
-        <w:br/>
-        <w:t>Batch segmentation is an embarrassingly parallel problem. Java's ForkJoinPool amortizes thread startup overhead, yielding a 6.8x speedup and processing 50 images in 863 ms (57.9 images per second).</w:t>
+        <w:rPr>
+          <w:b/>
+          <w:color w:val="1A365D"/>
+          <w:sz w:val="21"/>
+        </w:rPr>
+        <w:t>Figure 3: Parallel Speedup &amp; Thread Efficiency vs. Dataset Batch Size</w:t>
       </w:r>
+    </w:p>
+    <w:p>
+      <w:r>
+        <w:drawing>
+          <wp:inline xmlns:a="http://schemas.openxmlformats.org/drawingml/2006/main" xmlns:pic="http://schemas.openxmlformats.org/drawingml/2006/picture">
+            <wp:extent cx="5486400" cy="3429000"/>
+            <wp:docPr id="3" name="Picture 3"/>
+            <wp:cNvGraphicFramePr>
+              <a:graphicFrameLocks noChangeAspect="1"/>
+            </wp:cNvGraphicFramePr>
+            <a:graphic>
+              <a:graphicData uri="http://schemas.openxmlformats.org/drawingml/2006/picture">
+                <pic:pic>
+                  <pic:nvPicPr>
+                    <pic:cNvPr id="0" name="graph_thread_speedup.png"/>
+                    <pic:cNvPicPr/>
+                  </pic:nvPicPr>
+                  <pic:blipFill>
+                    <a:blip r:embed="rId11"/>
+                    <a:stretch>
+                      <a:fillRect/>
+                    </a:stretch>
+                  </pic:blipFill>
+                  <pic:spPr>
+                    <a:xfrm>
+                      <a:off x="0" y="0"/>
+                      <a:ext cx="5486400" cy="3429000"/>
+                    </a:xfrm>
+                    <a:prstGeom prst="rect"/>
+                  </pic:spPr>
+                </pic:pic>
+              </a:graphicData>
+            </a:graphic>
+          </wp:inline>
+        </w:drawing>
+      </w:r>
+    </w:p>
+    <w:p>
+      <w:pPr>
+        <w:spacing w:after="120"/>
+      </w:pPr>
+    </w:p>
+    <w:p>
+      <w:r>
+        <w:rPr>
+          <w:b/>
+          <w:color w:val="1A365D"/>
+          <w:sz w:val="21"/>
+        </w:rPr>
+        <w:t>Figure 4: Total Batch Wall-Clock Latency: Sequential vs. Multi-Threaded</w:t>
+      </w:r>
+    </w:p>
+    <w:p>
+      <w:r>
+        <w:drawing>
+          <wp:inline xmlns:a="http://schemas.openxmlformats.org/drawingml/2006/main" xmlns:pic="http://schemas.openxmlformats.org/drawingml/2006/picture">
+            <wp:extent cx="5486400" cy="3429000"/>
+            <wp:docPr id="4" name="Picture 4"/>
+            <wp:cNvGraphicFramePr>
+              <a:graphicFrameLocks noChangeAspect="1"/>
+            </wp:cNvGraphicFramePr>
+            <a:graphic>
+              <a:graphicData uri="http://schemas.openxmlformats.org/drawingml/2006/picture">
+                <pic:pic>
+                  <pic:nvPicPr>
+                    <pic:cNvPr id="0" name="graph_batch_execution_time.png"/>
+                    <pic:cNvPicPr/>
+                  </pic:nvPicPr>
+                  <pic:blipFill>
+                    <a:blip r:embed="rId12"/>
+                    <a:stretch>
+                      <a:fillRect/>
+                    </a:stretch>
+                  </pic:blipFill>
+                  <pic:spPr>
+                    <a:xfrm>
+                      <a:off x="0" y="0"/>
+                      <a:ext cx="5486400" cy="3429000"/>
+                    </a:xfrm>
+                    <a:prstGeom prst="rect"/>
+                  </pic:spPr>
+                </pic:pic>
+              </a:graphicData>
+            </a:graphic>
+          </wp:inline>
+        </w:drawing>
+      </w:r>
+    </w:p>
+    <w:p>
+      <w:pPr>
+        <w:spacing w:after="160"/>
+      </w:pPr>
     </w:p>
     <w:p>
       <w:pPr>
@@ -3134,7 +3366,7 @@
         <w:rPr>
           <w:b/>
           <w:color w:val="1A365D"/>
-          <w:sz w:val="36"/>
+          <w:sz w:val="34"/>
         </w:rPr>
         <w:t>7. Investigation 3: Quantitative Segmentation Quality</w:t>
       </w:r>
@@ -3629,7 +3861,7 @@
         <w:rPr>
           <w:b/>
           <w:color w:val="1A365D"/>
-          <w:sz w:val="36"/>
+          <w:sz w:val="34"/>
         </w:rPr>
         <w:t>8. Visual Segmentation Results (3-Panel Outputs)</w:t>
       </w:r>
@@ -3646,7 +3878,7 @@
           <w:color w:val="1A365D"/>
           <w:sz w:val="21"/>
         </w:rPr>
-        <w:t>Figure: Felzenszwalb Graph-Based Segmentation Output</w:t>
+        <w:t>Figure 5: Felzenszwalb Graph-Based Segmentation Output</w:t>
       </w:r>
     </w:p>
     <w:p>
@@ -3654,7 +3886,7 @@
         <w:drawing>
           <wp:inline xmlns:a="http://schemas.openxmlformats.org/drawingml/2006/main" xmlns:pic="http://schemas.openxmlformats.org/drawingml/2006/picture">
             <wp:extent cx="5669280" cy="2058227"/>
-            <wp:docPr id="1" name="Picture 1"/>
+            <wp:docPr id="5" name="Picture 5"/>
             <wp:cNvGraphicFramePr>
               <a:graphicFrameLocks noChangeAspect="1"/>
             </wp:cNvGraphicFramePr>
@@ -3666,7 +3898,7 @@
                     <pic:cNvPicPr/>
                   </pic:nvPicPr>
                   <pic:blipFill>
-                    <a:blip r:embed="rId9"/>
+                    <a:blip r:embed="rId13"/>
                     <a:stretch>
                       <a:fillRect/>
                     </a:stretch>
@@ -3697,7 +3929,7 @@
           <w:color w:val="1A365D"/>
           <w:sz w:val="21"/>
         </w:rPr>
-        <w:t>Figure: SLIC Superpixel Segmentation Output</w:t>
+        <w:t>Figure 6: SLIC Superpixel Segmentation Output</w:t>
       </w:r>
     </w:p>
     <w:p>
@@ -3705,7 +3937,7 @@
         <w:drawing>
           <wp:inline xmlns:a="http://schemas.openxmlformats.org/drawingml/2006/main" xmlns:pic="http://schemas.openxmlformats.org/drawingml/2006/picture">
             <wp:extent cx="5669280" cy="2058227"/>
-            <wp:docPr id="2" name="Picture 2"/>
+            <wp:docPr id="6" name="Picture 6"/>
             <wp:cNvGraphicFramePr>
               <a:graphicFrameLocks noChangeAspect="1"/>
             </wp:cNvGraphicFramePr>
@@ -3717,7 +3949,7 @@
                     <pic:cNvPicPr/>
                   </pic:nvPicPr>
                   <pic:blipFill>
-                    <a:blip r:embed="rId10"/>
+                    <a:blip r:embed="rId14"/>
                     <a:stretch>
                       <a:fillRect/>
                     </a:stretch>
@@ -3748,7 +3980,7 @@
           <w:color w:val="1A365D"/>
           <w:sz w:val="21"/>
         </w:rPr>
-        <w:t>Figure: K-Means Segmentation Output (CIELAB + Spatial-XY)</w:t>
+        <w:t>Figure 7: K-Means Segmentation Output (CIELAB + Spatial-XY)</w:t>
       </w:r>
     </w:p>
     <w:p>
@@ -3756,7 +3988,7 @@
         <w:drawing>
           <wp:inline xmlns:a="http://schemas.openxmlformats.org/drawingml/2006/main" xmlns:pic="http://schemas.openxmlformats.org/drawingml/2006/picture">
             <wp:extent cx="5669280" cy="2058227"/>
-            <wp:docPr id="3" name="Picture 3"/>
+            <wp:docPr id="7" name="Picture 7"/>
             <wp:cNvGraphicFramePr>
               <a:graphicFrameLocks noChangeAspect="1"/>
             </wp:cNvGraphicFramePr>
@@ -3768,7 +4000,7 @@
                     <pic:cNvPicPr/>
                   </pic:nvPicPr>
                   <pic:blipFill>
-                    <a:blip r:embed="rId11"/>
+                    <a:blip r:embed="rId15"/>
                     <a:stretch>
                       <a:fillRect/>
                     </a:stretch>
@@ -3799,7 +4031,7 @@
           <w:color w:val="1A365D"/>
           <w:sz w:val="21"/>
         </w:rPr>
-        <w:t>Figure: Multi-Level Otsu Thresholding Output</w:t>
+        <w:t>Figure 8: Multi-Level Otsu Thresholding Output</w:t>
       </w:r>
     </w:p>
     <w:p>
@@ -3807,7 +4039,7 @@
         <w:drawing>
           <wp:inline xmlns:a="http://schemas.openxmlformats.org/drawingml/2006/main" xmlns:pic="http://schemas.openxmlformats.org/drawingml/2006/picture">
             <wp:extent cx="5669280" cy="2058227"/>
-            <wp:docPr id="4" name="Picture 4"/>
+            <wp:docPr id="8" name="Picture 8"/>
             <wp:cNvGraphicFramePr>
               <a:graphicFrameLocks noChangeAspect="1"/>
             </wp:cNvGraphicFramePr>
@@ -3819,7 +4051,7 @@
                     <pic:cNvPicPr/>
                   </pic:nvPicPr>
                   <pic:blipFill>
-                    <a:blip r:embed="rId12"/>
+                    <a:blip r:embed="rId16"/>
                     <a:stretch>
                       <a:fillRect/>
                     </a:stretch>
@@ -3852,7 +4084,7 @@
         <w:rPr>
           <w:b/>
           <w:color w:val="1A365D"/>
-          <w:sz w:val="36"/>
+          <w:sz w:val="34"/>
         </w:rPr>
         <w:t>9. Conclusion &amp; References</w:t>
       </w:r>

</xml_diff>